<commit_message>
Add config and read from case appsetting
</commit_message>
<xml_diff>
--- a/Case Code Activity Classes/HR/Workforce Requisition Hiring Request/HRHiringRequest.docx
+++ b/Case Code Activity Classes/HR/Workforce Requisition Hiring Request/HRHiringRequest.docx
@@ -585,7 +585,11 @@
         </w:tc>
       </w:tr>
     </w:tbl>
-    <w:p/>
+    <w:p>
+      <w:pPr>
+        <w:pStyle w:val="SectionHeading"/>
+      </w:pPr>
+    </w:p>
     <w:p>
       <w:pPr>
         <w:pStyle w:val="SectionHeading"/>
@@ -888,14 +892,6 @@
       </w:pPr>
       <w:r>
         <w:t>Job Description</w:t>
-      </w:r>
-    </w:p>
-    <w:p>
-      <w:pPr>
-        <w:pStyle w:val="SmallNote"/>
-      </w:pPr>
-      <w:r>
-        <w:t>When Job Description is available, Education and Experience should follow the Job Description format. When it is not available, attach the job profile and complete the Education and Experience field.</w:t>
       </w:r>
     </w:p>
     <w:tbl>
@@ -1625,7 +1621,11 @@
         </w:tc>
       </w:tr>
     </w:tbl>
-    <w:p/>
+    <w:p>
+      <w:pPr>
+        <w:pStyle w:val="SectionHeading"/>
+      </w:pPr>
+    </w:p>
     <w:p>
       <w:pPr>
         <w:pStyle w:val="SectionHeading"/>

</xml_diff>